<commit_message>
add Transformer cross attention details
</commit_message>
<xml_diff>
--- a/paper_notes/Transformer.docx
+++ b/paper_notes/Transformer.docx
@@ -2898,6 +2898,325 @@
     <w:p>
       <w:pPr>
         <w:rPr>
+          <w:b/>
+          <w:bCs/>
+        </w:rPr>
+      </w:pPr>
+      <w:r>
+        <w:rPr>
+          <w:rFonts w:hint="eastAsia"/>
+          <w:b/>
+          <w:bCs/>
+        </w:rPr>
+        <w:t>Q1：训练和推理在生成文本时，最核心的区别是什么？</w:t>
+      </w:r>
+    </w:p>
+    <w:p>
+      <w:pPr>
+        <w:rPr>
+          <w:rFonts w:hint="eastAsia"/>
+        </w:rPr>
+      </w:pPr>
+      <w:r>
+        <w:rPr>
+          <w:rFonts w:hint="eastAsia"/>
+          <w:b/>
+          <w:bCs/>
+        </w:rPr>
+        <w:t>A：</w:t>
+      </w:r>
+      <w:r>
+        <w:rPr>
+          <w:rFonts w:hint="eastAsia"/>
+        </w:rPr>
+        <w:t> 训练是“开卷考试”，推理是“闭卷答题”。</w:t>
+      </w:r>
+    </w:p>
+    <w:p>
+      <w:pPr>
+        <w:numPr>
+          <w:ilvl w:val="0"/>
+          <w:numId w:val="4"/>
+        </w:numPr>
+        <w:rPr>
+          <w:rFonts w:hint="eastAsia"/>
+        </w:rPr>
+      </w:pPr>
+      <w:r>
+        <w:rPr>
+          <w:rFonts w:hint="eastAsia"/>
+        </w:rPr>
+        <w:t>训练（并行）：模型拥有上帝视角，标准答案（Ground Truth）全在卷子上。通过 Causal Mask，模型可以一次性并行处理所有词，同时预测并计算 Loss。</w:t>
+      </w:r>
+      <w:r>
+        <w:rPr>
+          <w:rFonts w:hint="eastAsia"/>
+        </w:rPr>
+        <w:t>加mask很简单，就是把attention算出来的score（@v之前）的右上角都加上负无穷，这样一个词对自己之后的词的关注就被抹除了。Decoder出来的每个向量都是这个位置的右移的目标句子的词，对自己之前的词的注意力后的向量。</w:t>
+      </w:r>
+    </w:p>
+    <w:p>
+      <w:pPr>
+        <w:numPr>
+          <w:ilvl w:val="0"/>
+          <w:numId w:val="4"/>
+        </w:numPr>
+        <w:rPr>
+          <w:rFonts w:hint="eastAsia"/>
+        </w:rPr>
+      </w:pPr>
+      <w:r>
+        <w:rPr>
+          <w:rFonts w:hint="eastAsia"/>
+        </w:rPr>
+        <w:t>推理（串行）：模型没有未来视角。必须采用自回归（Auto-regressive）机制，像“挤牙膏”一样一遍遍循环，每次只生成一个词，且后一个词的生成绝对依赖前一个词的结果。</w:t>
+      </w:r>
+      <w:r>
+        <w:rPr>
+          <w:rFonts w:hint="eastAsia"/>
+        </w:rPr>
+        <w:t>Attention计算没有mask，每次都完整地算attention和</w:t>
+      </w:r>
+      <w:r>
+        <w:rPr>
+          <w:rFonts w:hint="eastAsia"/>
+        </w:rPr>
+        <w:lastRenderedPageBreak/>
+        <w:t>cross attention。</w:t>
+      </w:r>
+    </w:p>
+    <w:p>
+      <w:pPr>
+        <w:rPr>
+          <w:rFonts w:hint="eastAsia"/>
+          <w:b/>
+          <w:bCs/>
+        </w:rPr>
+      </w:pPr>
+      <w:r>
+        <w:rPr>
+          <w:rFonts w:hint="eastAsia"/>
+          <w:b/>
+          <w:bCs/>
+        </w:rPr>
+        <w:t>Q2：推理阶段为什么必须依赖 KV Cache？</w:t>
+      </w:r>
+    </w:p>
+    <w:p>
+      <w:pPr>
+        <w:rPr>
+          <w:rFonts w:hint="eastAsia"/>
+        </w:rPr>
+      </w:pPr>
+      <w:r>
+        <w:rPr>
+          <w:rFonts w:hint="eastAsia"/>
+          <w:b/>
+          <w:bCs/>
+        </w:rPr>
+        <w:t>A：</w:t>
+      </w:r>
+      <w:r>
+        <w:rPr>
+          <w:rFonts w:hint="eastAsia"/>
+        </w:rPr>
+        <w:t> 为了“以空间换时间”，消除重复计算。</w:t>
+      </w:r>
+      <w:r>
+        <w:rPr>
+          <w:rFonts w:hint="eastAsia"/>
+        </w:rPr>
+        <w:br/>
+        <w:t>如果没有 KV Cache，模型每生成一个新词，都要把之前所有的词重新算一遍 K 和 V，计算复杂度呈 </w:t>
+      </w:r>
+      <w:r>
+        <w:t>O(N2)</w:t>
+      </w:r>
+      <w:r>
+        <w:rPr>
+          <w:i/>
+          <w:iCs/>
+        </w:rPr>
+        <w:t>O</w:t>
+      </w:r>
+      <w:r>
+        <w:t>(</w:t>
+      </w:r>
+      <w:r>
+        <w:rPr>
+          <w:i/>
+          <w:iCs/>
+        </w:rPr>
+        <w:t>N</w:t>
+      </w:r>
+      <w:r>
+        <w:t>2)</w:t>
+      </w:r>
+      <w:r>
+        <w:rPr>
+          <w:rFonts w:hint="eastAsia"/>
+        </w:rPr>
+        <w:t> 爆炸式增长。有了 KV Cache，模型只需计算当前新词的 Q，然后直接去缓存里“查字典”（复用历史的 K 和 V），将复杂度降到了 </w:t>
+      </w:r>
+      <w:r>
+        <w:t>O(N)</w:t>
+      </w:r>
+      <w:r>
+        <w:rPr>
+          <w:i/>
+          <w:iCs/>
+        </w:rPr>
+        <w:t>O</w:t>
+      </w:r>
+      <w:r>
+        <w:t>(</w:t>
+      </w:r>
+      <w:r>
+        <w:rPr>
+          <w:i/>
+          <w:iCs/>
+        </w:rPr>
+        <w:t>N</w:t>
+      </w:r>
+      <w:r>
+        <w:t>)</w:t>
+      </w:r>
+      <w:r>
+        <w:rPr>
+          <w:rFonts w:hint="eastAsia"/>
+        </w:rPr>
+        <w:t> 。</w:t>
+      </w:r>
+    </w:p>
+    <w:p>
+      <w:pPr>
+        <w:rPr>
+          <w:rFonts w:hint="eastAsia"/>
+          <w:b/>
+          <w:bCs/>
+        </w:rPr>
+      </w:pPr>
+      <w:r>
+        <w:rPr>
+          <w:rFonts w:hint="eastAsia"/>
+          <w:b/>
+          <w:bCs/>
+        </w:rPr>
+        <w:t>Q3：推理时还需要加 Causal Mask 吗？</w:t>
+      </w:r>
+    </w:p>
+    <w:p>
+      <w:pPr>
+        <w:rPr>
+          <w:rFonts w:hint="eastAsia"/>
+        </w:rPr>
+      </w:pPr>
+      <w:r>
+        <w:rPr>
+          <w:rFonts w:hint="eastAsia"/>
+          <w:b/>
+          <w:bCs/>
+        </w:rPr>
+        <w:t>A：</w:t>
+      </w:r>
+      <w:r>
+        <w:rPr>
+          <w:rFonts w:hint="eastAsia"/>
+        </w:rPr>
+        <w:t> 分阶段看：Prefill（预填充）阶段需要，Decode（解码）阶段不需要。</w:t>
+      </w:r>
+    </w:p>
+    <w:p>
+      <w:pPr>
+        <w:numPr>
+          <w:ilvl w:val="0"/>
+          <w:numId w:val="5"/>
+        </w:numPr>
+        <w:rPr>
+          <w:rFonts w:hint="eastAsia"/>
+        </w:rPr>
+      </w:pPr>
+      <w:r>
+        <w:rPr>
+          <w:rFonts w:hint="eastAsia"/>
+        </w:rPr>
+        <w:t>Prefill 阶段：一次性输入完整的 Prompt（如 10 个词），此时多个词同时存在，为了防止第 1 个词看到第 10 个词，必须加 Mask。</w:t>
+      </w:r>
+    </w:p>
+    <w:p>
+      <w:pPr>
+        <w:numPr>
+          <w:ilvl w:val="0"/>
+          <w:numId w:val="5"/>
+        </w:numPr>
+        <w:rPr>
+          <w:rFonts w:hint="eastAsia"/>
+        </w:rPr>
+      </w:pPr>
+      <w:r>
+        <w:rPr>
+          <w:rFonts w:hint="eastAsia"/>
+        </w:rPr>
+        <w:t>Decode 阶段：每次只输入 1 个新词，Q 只有 1 行。它天然位于序列的最末尾，物理上根本不存在“未来”的词可以偷看，因此绝对不需要加 Mask。</w:t>
+      </w:r>
+    </w:p>
+    <w:p>
+      <w:pPr>
+        <w:rPr>
+          <w:rFonts w:hint="eastAsia"/>
+          <w:b/>
+          <w:bCs/>
+        </w:rPr>
+      </w:pPr>
+      <w:r>
+        <w:rPr>
+          <w:rFonts w:hint="eastAsia"/>
+          <w:b/>
+          <w:bCs/>
+        </w:rPr>
+        <w:t>Q4：自回归生成 10 个词，真的是循环计算 10 遍吗？</w:t>
+      </w:r>
+    </w:p>
+    <w:p>
+      <w:pPr>
+        <w:rPr>
+          <w:rFonts w:hint="eastAsia"/>
+        </w:rPr>
+      </w:pPr>
+      <w:r>
+        <w:rPr>
+          <w:rFonts w:hint="eastAsia"/>
+          <w:b/>
+          <w:bCs/>
+        </w:rPr>
+        <w:t>A：</w:t>
+      </w:r>
+      <w:r>
+        <w:rPr>
+          <w:rFonts w:hint="eastAsia"/>
+        </w:rPr>
+        <w:t> 是的，循环 10 遍，但每一遍的计算极其轻量。</w:t>
+      </w:r>
+      <w:r>
+        <w:rPr>
+          <w:rFonts w:hint="eastAsia"/>
+        </w:rPr>
+        <w:br/>
+        <w:t>在 Decode 阶段的这 10 遍循环中，每一遍的 Q 永远只有 1 行（形状为 </w:t>
+      </w:r>
+      <w:r>
+        <w:t>[1, d_k]</w:t>
+      </w:r>
+      <w:r>
+        <w:rPr>
+          <w:rFonts w:hint="eastAsia"/>
+        </w:rPr>
+        <w:t>），K 和 V 永远是从 Cache 里直接拿的。所以 Attention 的计算永远只是 1 行 Q 和 N 列 K 的点积，算力开销被压缩到了极致。</w:t>
+      </w:r>
+    </w:p>
+    <w:p>
+      <w:pPr>
+        <w:rPr>
           <w:rFonts w:hint="eastAsia"/>
         </w:rPr>
       </w:pPr>
@@ -3345,6 +3664,7 @@
         <w:rPr>
           <w:rFonts w:hint="eastAsia"/>
         </w:rPr>
+        <w:lastRenderedPageBreak/>
         <w:t>处理流程：</w:t>
       </w:r>
     </w:p>
@@ -3604,9 +3924,9 @@
     </w:lvl>
   </w:abstractNum>
   <w:abstractNum w:abstractNumId="1" w15:restartNumberingAfterBreak="0">
-    <w:nsid w:val="28BD0399"/>
+    <w:nsid w:val="285747AE"/>
     <w:multiLevelType w:val="multilevel"/>
-    <w:tmpl w:val="502E600C"/>
+    <w:tmpl w:val="26EC8814"/>
     <w:lvl w:ilvl="0">
       <w:start w:val="1"/>
       <w:numFmt w:val="bullet"/>
@@ -3753,6 +4073,155 @@
     </w:lvl>
   </w:abstractNum>
   <w:abstractNum w:abstractNumId="2" w15:restartNumberingAfterBreak="0">
+    <w:nsid w:val="28BD0399"/>
+    <w:multiLevelType w:val="multilevel"/>
+    <w:tmpl w:val="502E600C"/>
+    <w:lvl w:ilvl="0">
+      <w:start w:val="1"/>
+      <w:numFmt w:val="bullet"/>
+      <w:lvlText w:val=""/>
+      <w:lvlJc w:val="left"/>
+      <w:pPr>
+        <w:tabs>
+          <w:tab w:val="num" w:pos="720"/>
+        </w:tabs>
+        <w:ind w:left="720" w:hanging="360"/>
+      </w:pPr>
+      <w:rPr>
+        <w:rFonts w:ascii="Symbol" w:hAnsi="Symbol" w:hint="default"/>
+        <w:sz w:val="20"/>
+      </w:rPr>
+    </w:lvl>
+    <w:lvl w:ilvl="1" w:tentative="1">
+      <w:start w:val="1"/>
+      <w:numFmt w:val="bullet"/>
+      <w:lvlText w:val="o"/>
+      <w:lvlJc w:val="left"/>
+      <w:pPr>
+        <w:tabs>
+          <w:tab w:val="num" w:pos="1440"/>
+        </w:tabs>
+        <w:ind w:left="1440" w:hanging="360"/>
+      </w:pPr>
+      <w:rPr>
+        <w:rFonts w:ascii="Courier New" w:hAnsi="Courier New" w:hint="default"/>
+        <w:sz w:val="20"/>
+      </w:rPr>
+    </w:lvl>
+    <w:lvl w:ilvl="2" w:tentative="1">
+      <w:start w:val="1"/>
+      <w:numFmt w:val="bullet"/>
+      <w:lvlText w:val=""/>
+      <w:lvlJc w:val="left"/>
+      <w:pPr>
+        <w:tabs>
+          <w:tab w:val="num" w:pos="2160"/>
+        </w:tabs>
+        <w:ind w:left="2160" w:hanging="360"/>
+      </w:pPr>
+      <w:rPr>
+        <w:rFonts w:ascii="Wingdings" w:hAnsi="Wingdings" w:hint="default"/>
+        <w:sz w:val="20"/>
+      </w:rPr>
+    </w:lvl>
+    <w:lvl w:ilvl="3" w:tentative="1">
+      <w:start w:val="1"/>
+      <w:numFmt w:val="bullet"/>
+      <w:lvlText w:val=""/>
+      <w:lvlJc w:val="left"/>
+      <w:pPr>
+        <w:tabs>
+          <w:tab w:val="num" w:pos="2880"/>
+        </w:tabs>
+        <w:ind w:left="2880" w:hanging="360"/>
+      </w:pPr>
+      <w:rPr>
+        <w:rFonts w:ascii="Wingdings" w:hAnsi="Wingdings" w:hint="default"/>
+        <w:sz w:val="20"/>
+      </w:rPr>
+    </w:lvl>
+    <w:lvl w:ilvl="4" w:tentative="1">
+      <w:start w:val="1"/>
+      <w:numFmt w:val="bullet"/>
+      <w:lvlText w:val=""/>
+      <w:lvlJc w:val="left"/>
+      <w:pPr>
+        <w:tabs>
+          <w:tab w:val="num" w:pos="3600"/>
+        </w:tabs>
+        <w:ind w:left="3600" w:hanging="360"/>
+      </w:pPr>
+      <w:rPr>
+        <w:rFonts w:ascii="Wingdings" w:hAnsi="Wingdings" w:hint="default"/>
+        <w:sz w:val="20"/>
+      </w:rPr>
+    </w:lvl>
+    <w:lvl w:ilvl="5" w:tentative="1">
+      <w:start w:val="1"/>
+      <w:numFmt w:val="bullet"/>
+      <w:lvlText w:val=""/>
+      <w:lvlJc w:val="left"/>
+      <w:pPr>
+        <w:tabs>
+          <w:tab w:val="num" w:pos="4320"/>
+        </w:tabs>
+        <w:ind w:left="4320" w:hanging="360"/>
+      </w:pPr>
+      <w:rPr>
+        <w:rFonts w:ascii="Wingdings" w:hAnsi="Wingdings" w:hint="default"/>
+        <w:sz w:val="20"/>
+      </w:rPr>
+    </w:lvl>
+    <w:lvl w:ilvl="6" w:tentative="1">
+      <w:start w:val="1"/>
+      <w:numFmt w:val="bullet"/>
+      <w:lvlText w:val=""/>
+      <w:lvlJc w:val="left"/>
+      <w:pPr>
+        <w:tabs>
+          <w:tab w:val="num" w:pos="5040"/>
+        </w:tabs>
+        <w:ind w:left="5040" w:hanging="360"/>
+      </w:pPr>
+      <w:rPr>
+        <w:rFonts w:ascii="Wingdings" w:hAnsi="Wingdings" w:hint="default"/>
+        <w:sz w:val="20"/>
+      </w:rPr>
+    </w:lvl>
+    <w:lvl w:ilvl="7" w:tentative="1">
+      <w:start w:val="1"/>
+      <w:numFmt w:val="bullet"/>
+      <w:lvlText w:val=""/>
+      <w:lvlJc w:val="left"/>
+      <w:pPr>
+        <w:tabs>
+          <w:tab w:val="num" w:pos="5760"/>
+        </w:tabs>
+        <w:ind w:left="5760" w:hanging="360"/>
+      </w:pPr>
+      <w:rPr>
+        <w:rFonts w:ascii="Wingdings" w:hAnsi="Wingdings" w:hint="default"/>
+        <w:sz w:val="20"/>
+      </w:rPr>
+    </w:lvl>
+    <w:lvl w:ilvl="8" w:tentative="1">
+      <w:start w:val="1"/>
+      <w:numFmt w:val="bullet"/>
+      <w:lvlText w:val=""/>
+      <w:lvlJc w:val="left"/>
+      <w:pPr>
+        <w:tabs>
+          <w:tab w:val="num" w:pos="6480"/>
+        </w:tabs>
+        <w:ind w:left="6480" w:hanging="360"/>
+      </w:pPr>
+      <w:rPr>
+        <w:rFonts w:ascii="Wingdings" w:hAnsi="Wingdings" w:hint="default"/>
+        <w:sz w:val="20"/>
+      </w:rPr>
+    </w:lvl>
+  </w:abstractNum>
+  <w:abstractNum w:abstractNumId="3" w15:restartNumberingAfterBreak="0">
     <w:nsid w:val="44C159EE"/>
     <w:multiLevelType w:val="multilevel"/>
     <w:tmpl w:val="7C762608"/>
@@ -3869,13 +4338,168 @@
       </w:pPr>
     </w:lvl>
   </w:abstractNum>
+  <w:abstractNum w:abstractNumId="4" w15:restartNumberingAfterBreak="0">
+    <w:nsid w:val="70665274"/>
+    <w:multiLevelType w:val="multilevel"/>
+    <w:tmpl w:val="D2D6DBA2"/>
+    <w:lvl w:ilvl="0">
+      <w:start w:val="1"/>
+      <w:numFmt w:val="bullet"/>
+      <w:lvlText w:val=""/>
+      <w:lvlJc w:val="left"/>
+      <w:pPr>
+        <w:tabs>
+          <w:tab w:val="num" w:pos="720"/>
+        </w:tabs>
+        <w:ind w:left="720" w:hanging="360"/>
+      </w:pPr>
+      <w:rPr>
+        <w:rFonts w:ascii="Symbol" w:hAnsi="Symbol" w:hint="default"/>
+        <w:sz w:val="20"/>
+      </w:rPr>
+    </w:lvl>
+    <w:lvl w:ilvl="1" w:tentative="1">
+      <w:start w:val="1"/>
+      <w:numFmt w:val="bullet"/>
+      <w:lvlText w:val="o"/>
+      <w:lvlJc w:val="left"/>
+      <w:pPr>
+        <w:tabs>
+          <w:tab w:val="num" w:pos="1440"/>
+        </w:tabs>
+        <w:ind w:left="1440" w:hanging="360"/>
+      </w:pPr>
+      <w:rPr>
+        <w:rFonts w:ascii="Courier New" w:hAnsi="Courier New" w:hint="default"/>
+        <w:sz w:val="20"/>
+      </w:rPr>
+    </w:lvl>
+    <w:lvl w:ilvl="2" w:tentative="1">
+      <w:start w:val="1"/>
+      <w:numFmt w:val="bullet"/>
+      <w:lvlText w:val=""/>
+      <w:lvlJc w:val="left"/>
+      <w:pPr>
+        <w:tabs>
+          <w:tab w:val="num" w:pos="2160"/>
+        </w:tabs>
+        <w:ind w:left="2160" w:hanging="360"/>
+      </w:pPr>
+      <w:rPr>
+        <w:rFonts w:ascii="Wingdings" w:hAnsi="Wingdings" w:hint="default"/>
+        <w:sz w:val="20"/>
+      </w:rPr>
+    </w:lvl>
+    <w:lvl w:ilvl="3" w:tentative="1">
+      <w:start w:val="1"/>
+      <w:numFmt w:val="bullet"/>
+      <w:lvlText w:val=""/>
+      <w:lvlJc w:val="left"/>
+      <w:pPr>
+        <w:tabs>
+          <w:tab w:val="num" w:pos="2880"/>
+        </w:tabs>
+        <w:ind w:left="2880" w:hanging="360"/>
+      </w:pPr>
+      <w:rPr>
+        <w:rFonts w:ascii="Wingdings" w:hAnsi="Wingdings" w:hint="default"/>
+        <w:sz w:val="20"/>
+      </w:rPr>
+    </w:lvl>
+    <w:lvl w:ilvl="4" w:tentative="1">
+      <w:start w:val="1"/>
+      <w:numFmt w:val="bullet"/>
+      <w:lvlText w:val=""/>
+      <w:lvlJc w:val="left"/>
+      <w:pPr>
+        <w:tabs>
+          <w:tab w:val="num" w:pos="3600"/>
+        </w:tabs>
+        <w:ind w:left="3600" w:hanging="360"/>
+      </w:pPr>
+      <w:rPr>
+        <w:rFonts w:ascii="Wingdings" w:hAnsi="Wingdings" w:hint="default"/>
+        <w:sz w:val="20"/>
+      </w:rPr>
+    </w:lvl>
+    <w:lvl w:ilvl="5" w:tentative="1">
+      <w:start w:val="1"/>
+      <w:numFmt w:val="bullet"/>
+      <w:lvlText w:val=""/>
+      <w:lvlJc w:val="left"/>
+      <w:pPr>
+        <w:tabs>
+          <w:tab w:val="num" w:pos="4320"/>
+        </w:tabs>
+        <w:ind w:left="4320" w:hanging="360"/>
+      </w:pPr>
+      <w:rPr>
+        <w:rFonts w:ascii="Wingdings" w:hAnsi="Wingdings" w:hint="default"/>
+        <w:sz w:val="20"/>
+      </w:rPr>
+    </w:lvl>
+    <w:lvl w:ilvl="6" w:tentative="1">
+      <w:start w:val="1"/>
+      <w:numFmt w:val="bullet"/>
+      <w:lvlText w:val=""/>
+      <w:lvlJc w:val="left"/>
+      <w:pPr>
+        <w:tabs>
+          <w:tab w:val="num" w:pos="5040"/>
+        </w:tabs>
+        <w:ind w:left="5040" w:hanging="360"/>
+      </w:pPr>
+      <w:rPr>
+        <w:rFonts w:ascii="Wingdings" w:hAnsi="Wingdings" w:hint="default"/>
+        <w:sz w:val="20"/>
+      </w:rPr>
+    </w:lvl>
+    <w:lvl w:ilvl="7" w:tentative="1">
+      <w:start w:val="1"/>
+      <w:numFmt w:val="bullet"/>
+      <w:lvlText w:val=""/>
+      <w:lvlJc w:val="left"/>
+      <w:pPr>
+        <w:tabs>
+          <w:tab w:val="num" w:pos="5760"/>
+        </w:tabs>
+        <w:ind w:left="5760" w:hanging="360"/>
+      </w:pPr>
+      <w:rPr>
+        <w:rFonts w:ascii="Wingdings" w:hAnsi="Wingdings" w:hint="default"/>
+        <w:sz w:val="20"/>
+      </w:rPr>
+    </w:lvl>
+    <w:lvl w:ilvl="8" w:tentative="1">
+      <w:start w:val="1"/>
+      <w:numFmt w:val="bullet"/>
+      <w:lvlText w:val=""/>
+      <w:lvlJc w:val="left"/>
+      <w:pPr>
+        <w:tabs>
+          <w:tab w:val="num" w:pos="6480"/>
+        </w:tabs>
+        <w:ind w:left="6480" w:hanging="360"/>
+      </w:pPr>
+      <w:rPr>
+        <w:rFonts w:ascii="Wingdings" w:hAnsi="Wingdings" w:hint="default"/>
+        <w:sz w:val="20"/>
+      </w:rPr>
+    </w:lvl>
+  </w:abstractNum>
   <w:num w:numId="1" w16cid:durableId="615328832">
     <w:abstractNumId w:val="0"/>
   </w:num>
   <w:num w:numId="2" w16cid:durableId="891308348">
+    <w:abstractNumId w:val="3"/>
+  </w:num>
+  <w:num w:numId="3" w16cid:durableId="482893867">
     <w:abstractNumId w:val="2"/>
   </w:num>
-  <w:num w:numId="3" w16cid:durableId="482893867">
+  <w:num w:numId="4" w16cid:durableId="1246959825">
+    <w:abstractNumId w:val="4"/>
+  </w:num>
+  <w:num w:numId="5" w16cid:durableId="1723553443">
     <w:abstractNumId w:val="1"/>
   </w:num>
 </w:numbering>
@@ -4487,7 +5111,6 @@
   <w:style w:type="character" w:default="1" w:styleId="a0">
     <w:name w:val="Default Paragraph Font"/>
     <w:uiPriority w:val="1"/>
-    <w:semiHidden/>
     <w:unhideWhenUsed/>
   </w:style>
   <w:style w:type="table" w:default="1" w:styleId="a1">

</xml_diff>